<commit_message>
feat(exports): update CSU 3-column header layout and centered footer date for student records exports
</commit_message>
<xml_diff>
--- a/tests/exports/empty_section_records.docx
+++ b/tests/exports/empty_section_records.docx
@@ -4,51 +4,228 @@
   <w:body>
     <w:tbl>
       <w:tblGrid>
-        <w:gridCol w:w="12240" w:type="dxa"/>
+        <w:gridCol w:w="6048" w:type="dxa"/>
+        <w:gridCol w:w="3297.6" w:type="dxa"/>
+        <w:gridCol w:w="6048" w:type="dxa"/>
       </w:tblGrid>
       <w:tblPr>
         <w:jc w:val="center"/>
         <w:tblW w:w="0" w:type="auto"/>
         <w:tblLayout w:type="autofit"/>
         <w:tblCellMar>
-          <w:top w:w="50" w:type="dxa"/>
-          <w:left w:w="50" w:type="dxa"/>
-          <w:right w:w="50" w:type="dxa"/>
-          <w:bottom w:w="50" w:type="dxa"/>
+          <w:top w:w="30" w:type="dxa"/>
+          <w:left w:w="30" w:type="dxa"/>
+          <w:right w:w="30" w:type="dxa"/>
+          <w:bottom w:w="30" w:type="dxa"/>
         </w:tblCellMar>
       </w:tblPr>
       <w:tr>
         <w:trPr/>
         <w:tc>
           <w:tcPr>
-            <w:tcW w:w="12240" w:type="dxa"/>
+            <w:tcW w:w="6048" w:type="dxa"/>
+            <w:vAlign w:val="center"/>
+            <w:noWrap/>
+          </w:tcPr>
+          <w:p>
+            <w:pPr>
+              <w:spacing w:after="10"/>
+            </w:pPr>
+            <w:r>
+              <w:rPr>
+                <w:rFonts w:ascii="Arial" w:hAnsi="Arial" w:eastAsia="Arial" w:cs="Arial"/>
+                <w:color w:val="000000"/>
+                <w:sz w:val="15"/>
+                <w:szCs w:val="15"/>
+                <w:b w:val="1"/>
+                <w:bCs w:val="1"/>
+              </w:rPr>
+              <w:t xml:space="preserve">REPUBLIC OF THE PHILIPPINES</w:t>
+            </w:r>
+          </w:p>
+          <w:p>
+            <w:pPr>
+              <w:spacing w:after="10"/>
+            </w:pPr>
+            <w:r>
+              <w:rPr>
+                <w:rFonts w:ascii="Arial" w:hAnsi="Arial" w:eastAsia="Arial" w:cs="Arial"/>
+                <w:color w:val="000000"/>
+                <w:sz w:val="18"/>
+                <w:szCs w:val="18"/>
+                <w:b w:val="1"/>
+                <w:bCs w:val="1"/>
+              </w:rPr>
+              <w:t xml:space="preserve">CAGAYAN STATE UNIVERSITY</w:t>
+            </w:r>
+          </w:p>
+          <w:p>
+            <w:pPr>
+              <w:spacing w:after="0"/>
+            </w:pPr>
+            <w:r>
+              <w:rPr>
+                <w:rFonts w:ascii="Arial" w:hAnsi="Arial" w:eastAsia="Arial" w:cs="Arial"/>
+                <w:color w:val="000000"/>
+                <w:sz w:val="14"/>
+                <w:szCs w:val="14"/>
+              </w:rPr>
+              <w:t xml:space="preserve">Andrews Campus, Tuguegarao City, Cagayan (Central Office)
+CSU Lal-lo Campus, Sta. Maria, Lal-lo, Cagayan (Sub Office)</w:t>
+            </w:r>
+          </w:p>
+        </w:tc>
+        <w:tc>
+          <w:tcPr>
+            <w:tcW w:w="3297.6" w:type="dxa"/>
+            <w:vAlign w:val="center"/>
             <w:noWrap/>
           </w:tcPr>
           <w:p>
             <w:pPr>
               <w:jc w:val="center"/>
-              <w:spacing w:after="20"/>
-            </w:pPr>
-            <w:r>
-              <w:rPr>
-                <w:rFonts w:ascii="Arial" w:hAnsi="Arial" w:eastAsia="Arial" w:cs="Arial"/>
-                <w:color w:val="000000"/>
-                <w:sz w:val="26"/>
-                <w:szCs w:val="26"/>
-                <w:b w:val="1"/>
-                <w:bCs w:val="1"/>
-              </w:rPr>
-              <w:t xml:space="preserve">CSU - Lal-lo Campus</w:t>
-            </w:r>
-          </w:p>
+            </w:pPr>
+            <w:r>
+              <w:pict>
+                <v:shape type="#_x0000_t75" stroked="f" style="width:48pt; height:48pt; margin-left:0pt; margin-top:0pt; mso-position-horizontal:left; mso-position-vertical:top; mso-position-horizontal-relative:char; mso-position-vertical-relative:line;">
+                  <w10:wrap type="inline"/>
+                  <v:imagedata r:id="rId7" o:title=""/>
+                </v:shape>
+              </w:pict>
+            </w:r>
+          </w:p>
+        </w:tc>
+        <w:tc>
+          <w:tcPr>
+            <w:tcW w:w="6048" w:type="dxa"/>
+            <w:vAlign w:val="center"/>
+            <w:noWrap/>
+          </w:tcPr>
+          <w:p>
+            <w:pPr>
+              <w:spacing w:after="10"/>
+            </w:pPr>
+            <w:r>
+              <w:rPr>
+                <w:rFonts w:ascii="Arial" w:hAnsi="Arial" w:eastAsia="Arial" w:cs="Arial"/>
+                <w:color w:val="000000"/>
+                <w:sz w:val="14"/>
+                <w:szCs w:val="14"/>
+                <w:b w:val="1"/>
+                <w:bCs w:val="1"/>
+              </w:rPr>
+              <w:t xml:space="preserve">Phone Number: </w:t>
+            </w:r>
+            <w:r>
+              <w:rPr>
+                <w:rFonts w:ascii="Arial" w:hAnsi="Arial" w:eastAsia="Arial" w:cs="Arial"/>
+                <w:color w:val="000000"/>
+                <w:sz w:val="14"/>
+                <w:szCs w:val="14"/>
+              </w:rPr>
+              <w:t xml:space="preserve">0945-0898-648</w:t>
+            </w:r>
+          </w:p>
+          <w:p>
+            <w:pPr>
+              <w:spacing w:after="10"/>
+            </w:pPr>
+            <w:r>
+              <w:rPr>
+                <w:rFonts w:ascii="Arial" w:hAnsi="Arial" w:eastAsia="Arial" w:cs="Arial"/>
+                <w:color w:val="000000"/>
+                <w:sz w:val="14"/>
+                <w:szCs w:val="14"/>
+                <w:b w:val="1"/>
+                <w:bCs w:val="1"/>
+              </w:rPr>
+              <w:t xml:space="preserve">Email Address: </w:t>
+            </w:r>
+            <w:r>
+              <w:rPr>
+                <w:rFonts w:ascii="Arial" w:hAnsi="Arial" w:eastAsia="Arial" w:cs="Arial"/>
+                <w:color w:val="000000"/>
+                <w:sz w:val="14"/>
+                <w:szCs w:val="14"/>
+              </w:rPr>
+              <w:t xml:space="preserve">cicspadayaperformingartsguild@gmail.com</w:t>
+            </w:r>
+          </w:p>
+          <w:p>
+            <w:pPr>
+              <w:spacing w:after="0"/>
+            </w:pPr>
+            <w:r>
+              <w:rPr>
+                <w:rFonts w:ascii="Arial" w:hAnsi="Arial" w:eastAsia="Arial" w:cs="Arial"/>
+                <w:color w:val="000000"/>
+                <w:sz w:val="14"/>
+                <w:szCs w:val="14"/>
+                <w:b w:val="1"/>
+                <w:bCs w:val="1"/>
+              </w:rPr>
+              <w:t xml:space="preserve">Facebook page: </w:t>
+            </w:r>
+            <w:r>
+              <w:rPr>
+                <w:rFonts w:ascii="Arial" w:hAnsi="Arial" w:eastAsia="Arial" w:cs="Arial"/>
+                <w:color w:val="000000"/>
+                <w:sz w:val="14"/>
+                <w:szCs w:val="14"/>
+              </w:rPr>
+              <w:t xml:space="preserve">CICS Padaya Performing Arts Guild</w:t>
+            </w:r>
+          </w:p>
+        </w:tc>
+      </w:tr>
+    </w:tbl>
+    <w:p>
+      <w:pPr>
+        <w:jc w:val="center"/>
+        <w:spacing w:before="80" w:after="40"/>
+      </w:pPr>
+      <w:r>
+        <w:rPr>
+          <w:rFonts w:ascii="Arial" w:hAnsi="Arial" w:eastAsia="Arial" w:cs="Arial"/>
+          <w:color w:val="000000"/>
+          <w:sz w:val="22"/>
+          <w:szCs w:val="22"/>
+          <w:b w:val="1"/>
+          <w:bCs w:val="1"/>
+        </w:rPr>
+        <w:t xml:space="preserve">CAGAYAN STATE UNIVERSITY Lal-lo Campus</w:t>
+      </w:r>
+    </w:p>
+    <w:tbl>
+      <w:tblGrid>
+        <w:gridCol w:w="15390" w:type="dxa"/>
+      </w:tblGrid>
+      <w:tblPr>
+        <w:jc w:val="center"/>
+        <w:tblW w:w="0" w:type="auto"/>
+        <w:tblLayout w:type="autofit"/>
+      </w:tblPr>
+      <w:tr>
+        <w:trPr>
+          <w:trHeight w:val="1" w:hRule="atLeast"/>
+        </w:trPr>
+        <w:tc>
+          <w:tcPr>
+            <w:tcW w:w="15390" w:type="dxa"/>
+            <w:tcBorders>
+              <w:bottom w:val="single" w:sz="12" w:color="000000"/>
+            </w:tcBorders>
+            <w:noWrap/>
+          </w:tcPr>
+          <w:p/>
         </w:tc>
       </w:tr>
     </w:tbl>
     <w:p>
       <w:pPr>
         <w:rPr>
-          <w:sz w:val="8"/>
-          <w:szCs w:val="8"/>
+          <w:sz w:val="12"/>
+          <w:szCs w:val="12"/>
         </w:rPr>
       </w:pPr>
     </w:p>
@@ -384,7 +561,7 @@
       </w:tr>
     </w:tbl>
     <w:sectPr>
-      <w:footerReference w:type="default" r:id="rId7"/>
+      <w:footerReference w:type="default" r:id="rId8"/>
       <w:pgSz w:orient="landscape" w:w="16833.6" w:h="11908.8"/>
       <w:pgMar w:top="720" w:right="720" w:bottom="720" w:left="720" w:header="720" w:footer="720" w:gutter="0"/>
       <w:cols w:num="1" w:space="720"/>
@@ -401,9 +578,8 @@
 <w:ftr xmlns:ve="http://schemas.openxmlformats.org/markup-compatibility/2006" xmlns:o="urn:schemas-microsoft-com:office:office" xmlns:r="http://schemas.openxmlformats.org/officeDocument/2006/relationships" xmlns:m="http://schemas.openxmlformats.org/officeDocument/2006/math" xmlns:v="urn:schemas-microsoft-com:vml" xmlns:wp="http://schemas.openxmlformats.org/drawingml/2006/wordprocessingDrawing" xmlns:w10="urn:schemas-microsoft-com:office:word" xmlns:w="http://schemas.openxmlformats.org/wordprocessingml/2006/main" xmlns:wne="http://schemas.microsoft.com/office/word/2006/wordml">
   <w:tbl>
     <w:tblGrid>
-      <w:gridCol w:w="5760" w:type="dxa"/>
-      <w:gridCol w:w="5040" w:type="dxa"/>
-      <w:gridCol w:w="4608" w:type="dxa"/>
+      <w:gridCol w:w="7689.599999999999" w:type="dxa"/>
+      <w:gridCol w:w="7689.599999999999" w:type="dxa"/>
     </w:tblGrid>
     <w:tblPr>
       <w:jc w:val="center"/>
@@ -420,7 +596,7 @@
       <w:trPr/>
       <w:tc>
         <w:tcPr>
-          <w:tcW w:w="5760" w:type="dxa"/>
+          <w:tcW w:w="7689.599999999999" w:type="dxa"/>
           <w:noWrap/>
         </w:tcPr>
         <w:p>
@@ -440,7 +616,7 @@
       </w:tc>
       <w:tc>
         <w:tcPr>
-          <w:tcW w:w="5040" w:type="dxa"/>
+          <w:tcW w:w="7689.599999999999" w:type="dxa"/>
           <w:noWrap/>
         </w:tcPr>
         <w:p>
@@ -454,72 +630,7 @@
               <w:sz w:val="17"/>
               <w:szCs w:val="17"/>
             </w:rPr>
-            <w:t xml:space="preserve">October 17, 2026</w:t>
-          </w:r>
-        </w:p>
-      </w:tc>
-      <w:tc>
-        <w:tcPr>
-          <w:tcW w:w="4608" w:type="dxa"/>
-          <w:noWrap/>
-        </w:tcPr>
-        <w:p>
-          <w:pPr>
-            <w:jc w:val="right"/>
-          </w:pPr>
-          <w:r>
-            <w:rPr>
-              <w:rFonts w:ascii="Arial" w:hAnsi="Arial" w:eastAsia="Arial" w:cs="Arial"/>
-              <w:color w:val="000000"/>
-              <w:sz w:val="17"/>
-              <w:szCs w:val="17"/>
-            </w:rPr>
-            <w:t xml:space="preserve">Page </w:t>
-          </w:r>
-          <w:r>
-            <w:fldChar w:fldCharType="begin"/>
-          </w:r>
-          <w:r>
-            <w:instrText xml:space="preserve"> PAGE </w:instrText>
-          </w:r>
-          <w:r>
-            <w:fldChar w:fldCharType="separate"/>
-          </w:r>
-          <w:r>
-            <w:rPr>
-              <w:noProof/>
-            </w:rPr>
-            <w:t>1</w:t>
-          </w:r>
-          <w:r>
-            <w:fldChar w:fldCharType="end"/>
-          </w:r>
-          <w:r>
-            <w:rPr>
-              <w:rFonts w:ascii="Arial" w:hAnsi="Arial" w:eastAsia="Arial" w:cs="Arial"/>
-              <w:color w:val="000000"/>
-              <w:sz w:val="17"/>
-              <w:szCs w:val="17"/>
-            </w:rPr>
-            <w:t xml:space="preserve"> of </w:t>
-          </w:r>
-          <w:r>
-            <w:fldChar w:fldCharType="begin"/>
-          </w:r>
-          <w:r>
-            <w:instrText xml:space="preserve"> NUMPAGES </w:instrText>
-          </w:r>
-          <w:r>
-            <w:fldChar w:fldCharType="separate"/>
-          </w:r>
-          <w:r>
-            <w:rPr>
-              <w:noProof/>
-            </w:rPr>
-            <w:t>1</w:t>
-          </w:r>
-          <w:r>
-            <w:fldChar w:fldCharType="end"/>
+            <w:t xml:space="preserve">October 18, 2026</w:t>
           </w:r>
         </w:p>
       </w:tc>

</xml_diff>

<commit_message>
fix(print): isolate modal printout in dedicated iframe to prevent duplicate pages and add 10 student seeders
</commit_message>
<xml_diff>
--- a/tests/exports/empty_section_records.docx
+++ b/tests/exports/empty_section_records.docx
@@ -61,7 +61,7 @@
           </w:p>
           <w:p>
             <w:pPr>
-              <w:spacing w:after="0"/>
+              <w:spacing w:after="10"/>
             </w:pPr>
             <w:r>
               <w:rPr>
@@ -70,8 +70,21 @@
                 <w:sz w:val="14"/>
                 <w:szCs w:val="14"/>
               </w:rPr>
-              <w:t xml:space="preserve">Andrews Campus, Tuguegarao City, Cagayan (Central Office)
-CSU Lal-lo Campus, Sta. Maria, Lal-lo, Cagayan (Sub Office)</w:t>
+              <w:t xml:space="preserve">Andrews Campus, Tuguegarao City, Cagayan (Central Office)</w:t>
+            </w:r>
+          </w:p>
+          <w:p>
+            <w:pPr>
+              <w:spacing w:after="0"/>
+            </w:pPr>
+            <w:r>
+              <w:rPr>
+                <w:rFonts w:ascii="Arial" w:hAnsi="Arial" w:eastAsia="Arial" w:cs="Arial"/>
+                <w:color w:val="000000"/>
+                <w:sz w:val="14"/>
+                <w:szCs w:val="14"/>
+              </w:rPr>
+              <w:t xml:space="preserve">CSU Lal-lo Campus, Sta. Maria, Lal-lo, Cagayan (Sub Office)</w:t>
             </w:r>
           </w:p>
         </w:tc>
@@ -109,21 +122,12 @@
               <w:rPr>
                 <w:rFonts w:ascii="Arial" w:hAnsi="Arial" w:eastAsia="Arial" w:cs="Arial"/>
                 <w:color w:val="000000"/>
-                <w:sz w:val="14"/>
-                <w:szCs w:val="14"/>
-                <w:b w:val="1"/>
-                <w:bCs w:val="1"/>
-              </w:rPr>
-              <w:t xml:space="preserve">Phone Number: </w:t>
-            </w:r>
-            <w:r>
-              <w:rPr>
-                <w:rFonts w:ascii="Arial" w:hAnsi="Arial" w:eastAsia="Arial" w:cs="Arial"/>
-                <w:color w:val="000000"/>
-                <w:sz w:val="14"/>
-                <w:szCs w:val="14"/>
-              </w:rPr>
-              <w:t xml:space="preserve">0945-0898-648</w:t>
+                <w:sz w:val="15"/>
+                <w:szCs w:val="15"/>
+                <w:b w:val="1"/>
+                <w:bCs w:val="1"/>
+              </w:rPr>
+              <w:t xml:space="preserve">Phone Number:</w:t>
             </w:r>
           </w:p>
           <w:p>
@@ -134,21 +138,12 @@
               <w:rPr>
                 <w:rFonts w:ascii="Arial" w:hAnsi="Arial" w:eastAsia="Arial" w:cs="Arial"/>
                 <w:color w:val="000000"/>
-                <w:sz w:val="14"/>
-                <w:szCs w:val="14"/>
-                <w:b w:val="1"/>
-                <w:bCs w:val="1"/>
-              </w:rPr>
-              <w:t xml:space="preserve">Email Address: </w:t>
-            </w:r>
-            <w:r>
-              <w:rPr>
-                <w:rFonts w:ascii="Arial" w:hAnsi="Arial" w:eastAsia="Arial" w:cs="Arial"/>
-                <w:color w:val="000000"/>
-                <w:sz w:val="14"/>
-                <w:szCs w:val="14"/>
-              </w:rPr>
-              <w:t xml:space="preserve">cicspadayaperformingartsguild@gmail.com</w:t>
+                <w:sz w:val="15"/>
+                <w:szCs w:val="15"/>
+                <w:b w:val="1"/>
+                <w:bCs w:val="1"/>
+              </w:rPr>
+              <w:t xml:space="preserve">Email Address:</w:t>
             </w:r>
           </w:p>
           <w:p>
@@ -159,21 +154,12 @@
               <w:rPr>
                 <w:rFonts w:ascii="Arial" w:hAnsi="Arial" w:eastAsia="Arial" w:cs="Arial"/>
                 <w:color w:val="000000"/>
-                <w:sz w:val="14"/>
-                <w:szCs w:val="14"/>
-                <w:b w:val="1"/>
-                <w:bCs w:val="1"/>
-              </w:rPr>
-              <w:t xml:space="preserve">Facebook page: </w:t>
-            </w:r>
-            <w:r>
-              <w:rPr>
-                <w:rFonts w:ascii="Arial" w:hAnsi="Arial" w:eastAsia="Arial" w:cs="Arial"/>
-                <w:color w:val="000000"/>
-                <w:sz w:val="14"/>
-                <w:szCs w:val="14"/>
-              </w:rPr>
-              <w:t xml:space="preserve">CICS Padaya Performing Arts Guild</w:t>
+                <w:sz w:val="15"/>
+                <w:szCs w:val="15"/>
+                <w:b w:val="1"/>
+                <w:bCs w:val="1"/>
+              </w:rPr>
+              <w:t xml:space="preserve">Facebook page:</w:t>
             </w:r>
           </w:p>
         </w:tc>
@@ -224,8 +210,8 @@
     <w:p>
       <w:pPr>
         <w:rPr>
-          <w:sz w:val="12"/>
-          <w:szCs w:val="12"/>
+          <w:sz w:val="24"/>
+          <w:szCs w:val="24"/>
         </w:rPr>
       </w:pPr>
     </w:p>

</xml_diff>